<commit_message>
Updated cover letter templates
</commit_message>
<xml_diff>
--- a/DataAnalyst_CoverLetterTemplate.docx
+++ b/DataAnalyst_CoverLetterTemplate.docx
@@ -385,7 +385,83 @@
           <w:szCs w:val="18"/>
           <w:lang w:val="en-CA"/>
         </w:rPr>
-        <w:t>Dear Hiring Manager,</w:t>
+        <w:t xml:space="preserve">Dear </w:t>
+      </w:r>
+      <w:proofErr w:type="gramStart"/>
+      <w:r>
+        <w:rPr>
+          <w:rFonts w:ascii="Calibri Light" w:eastAsia="Cambria" w:hAnsi="Calibri Light" w:cs="Calibri Light"/>
+          <w:bCs/>
+          <w:sz w:val="18"/>
+          <w:szCs w:val="18"/>
+          <w:lang w:val="en-CA"/>
+        </w:rPr>
+        <w:t xml:space="preserve">{{ </w:t>
+      </w:r>
+      <w:proofErr w:type="spellStart"/>
+      <w:r>
+        <w:rPr>
+          <w:rFonts w:ascii="Calibri Light" w:eastAsia="Cambria" w:hAnsi="Calibri Light" w:cs="Calibri Light"/>
+          <w:bCs/>
+          <w:sz w:val="18"/>
+          <w:szCs w:val="18"/>
+          <w:lang w:val="en-CA"/>
+        </w:rPr>
+        <w:t>letter</w:t>
+      </w:r>
+      <w:proofErr w:type="gramEnd"/>
+      <w:r>
+        <w:rPr>
+          <w:rFonts w:ascii="Calibri Light" w:eastAsia="Cambria" w:hAnsi="Calibri Light" w:cs="Calibri Light"/>
+          <w:bCs/>
+          <w:sz w:val="18"/>
+          <w:szCs w:val="18"/>
+          <w:lang w:val="en-CA"/>
+        </w:rPr>
+        <w:t>_</w:t>
+      </w:r>
+      <w:proofErr w:type="gramStart"/>
+      <w:r>
+        <w:rPr>
+          <w:rFonts w:ascii="Calibri Light" w:eastAsia="Cambria" w:hAnsi="Calibri Light" w:cs="Calibri Light"/>
+          <w:bCs/>
+          <w:sz w:val="18"/>
+          <w:szCs w:val="18"/>
+          <w:lang w:val="en-CA"/>
+        </w:rPr>
+        <w:t>addressee</w:t>
+      </w:r>
+      <w:proofErr w:type="spellEnd"/>
+      <w:r>
+        <w:rPr>
+          <w:rFonts w:ascii="Calibri Light" w:eastAsia="Cambria" w:hAnsi="Calibri Light" w:cs="Calibri Light"/>
+          <w:bCs/>
+          <w:sz w:val="18"/>
+          <w:szCs w:val="18"/>
+          <w:lang w:val="en-CA"/>
+        </w:rPr>
+        <w:t xml:space="preserve"> }</w:t>
+      </w:r>
+      <w:proofErr w:type="gramEnd"/>
+      <w:r>
+        <w:rPr>
+          <w:rFonts w:ascii="Calibri Light" w:eastAsia="Cambria" w:hAnsi="Calibri Light" w:cs="Calibri Light"/>
+          <w:bCs/>
+          <w:sz w:val="18"/>
+          <w:szCs w:val="18"/>
+          <w:lang w:val="en-CA"/>
+        </w:rPr>
+        <w:t>}</w:t>
+      </w:r>
+      <w:r>
+        <w:rPr>
+          <w:rFonts w:ascii="Calibri Light" w:eastAsia="Cambria" w:hAnsi="Calibri Light" w:cs="Calibri Light"/>
+          <w:bCs/>
+          <w:sz w:val="18"/>
+          <w:szCs w:val="18"/>
+          <w:lang w:val="en-CA"/>
+        </w:rPr>
+        <w:t>,</w:t>
       </w:r>
     </w:p>
     <w:p>

</xml_diff>

<commit_message>
Updated templates for proper date formatting + added bioinformatics template cover letter
</commit_message>
<xml_diff>
--- a/DataAnalyst_CoverLetterTemplate.docx
+++ b/DataAnalyst_CoverLetterTemplate.docx
@@ -21,7 +21,6 @@
           <w:lang w:val="en-CA"/>
         </w:rPr>
       </w:pPr>
-      <w:proofErr w:type="gramStart"/>
       <w:r>
         <w:rPr>
           <w:rFonts w:ascii="Calibri Light" w:eastAsia="Cambria" w:hAnsi="Calibri Light" w:cs="Calibri Light"/>
@@ -32,7 +31,16 @@
         </w:rPr>
         <w:t>{{ t</w:t>
       </w:r>
-      <w:proofErr w:type="gramEnd"/>
+      <w:r>
+        <w:rPr>
+          <w:rFonts w:ascii="Calibri Light" w:eastAsia="Cambria" w:hAnsi="Calibri Light" w:cs="Calibri Light"/>
+          <w:bCs/>
+          <w:sz w:val="18"/>
+          <w:szCs w:val="18"/>
+          <w:lang w:val="en-CA"/>
+        </w:rPr>
+        <w:t>odays_date</w:t>
+      </w:r>
       <w:r>
         <w:rPr>
           <w:rFonts w:ascii="Calibri Light" w:eastAsia="Cambria" w:hAnsi="Calibri Light" w:cs="Calibri Light"/>
@@ -62,50 +70,7 @@
           <w:lang w:val="en-CA"/>
         </w:rPr>
         <w:br/>
-      </w:r>
-      <w:proofErr w:type="gramStart"/>
-      <w:r>
-        <w:rPr>
-          <w:rFonts w:ascii="Calibri Light" w:eastAsia="Cambria" w:hAnsi="Calibri Light" w:cs="Calibri Light"/>
-          <w:bCs/>
-          <w:sz w:val="18"/>
-          <w:szCs w:val="18"/>
-          <w:lang w:val="en-CA"/>
-        </w:rPr>
-        <w:t xml:space="preserve">{{ </w:t>
-      </w:r>
-      <w:proofErr w:type="spellStart"/>
-      <w:r>
-        <w:rPr>
-          <w:rFonts w:ascii="Calibri Light" w:eastAsia="Cambria" w:hAnsi="Calibri Light" w:cs="Calibri Light"/>
-          <w:bCs/>
-          <w:sz w:val="18"/>
-          <w:szCs w:val="18"/>
-          <w:lang w:val="en-CA"/>
-        </w:rPr>
-        <w:t>company</w:t>
-      </w:r>
-      <w:proofErr w:type="gramEnd"/>
-      <w:r>
-        <w:rPr>
-          <w:rFonts w:ascii="Calibri Light" w:eastAsia="Cambria" w:hAnsi="Calibri Light" w:cs="Calibri Light"/>
-          <w:bCs/>
-          <w:sz w:val="18"/>
-          <w:szCs w:val="18"/>
-          <w:lang w:val="en-CA"/>
-        </w:rPr>
-        <w:t>_name</w:t>
-      </w:r>
-      <w:proofErr w:type="spellEnd"/>
-      <w:r>
-        <w:rPr>
-          <w:rFonts w:ascii="Calibri Light" w:eastAsia="Cambria" w:hAnsi="Calibri Light" w:cs="Calibri Light"/>
-          <w:bCs/>
-          <w:sz w:val="18"/>
-          <w:szCs w:val="18"/>
-          <w:lang w:val="en-CA"/>
-        </w:rPr>
-        <w:t xml:space="preserve"> }}</w:t>
+        <w:t>{{ company_name }}</w:t>
       </w:r>
       <w:r>
         <w:rPr>
@@ -116,72 +81,7 @@
           <w:lang w:val="en-CA"/>
         </w:rPr>
         <w:br/>
-      </w:r>
-      <w:proofErr w:type="gramStart"/>
-      <w:r>
-        <w:rPr>
-          <w:rFonts w:ascii="Calibri Light" w:eastAsia="Cambria" w:hAnsi="Calibri Light" w:cs="Calibri Light"/>
-          <w:bCs/>
-          <w:sz w:val="18"/>
-          <w:szCs w:val="18"/>
-          <w:lang w:val="en-CA"/>
-        </w:rPr>
-        <w:t xml:space="preserve">{{ </w:t>
-      </w:r>
-      <w:proofErr w:type="spellStart"/>
-      <w:r>
-        <w:rPr>
-          <w:rFonts w:ascii="Calibri Light" w:eastAsia="Cambria" w:hAnsi="Calibri Light" w:cs="Calibri Light"/>
-          <w:bCs/>
-          <w:sz w:val="18"/>
-          <w:szCs w:val="18"/>
-          <w:lang w:val="en-CA"/>
-        </w:rPr>
-        <w:t>company</w:t>
-      </w:r>
-      <w:proofErr w:type="gramEnd"/>
-      <w:r>
-        <w:rPr>
-          <w:rFonts w:ascii="Calibri Light" w:eastAsia="Cambria" w:hAnsi="Calibri Light" w:cs="Calibri Light"/>
-          <w:bCs/>
-          <w:sz w:val="18"/>
-          <w:szCs w:val="18"/>
-          <w:lang w:val="en-CA"/>
-        </w:rPr>
-        <w:t>_</w:t>
-      </w:r>
-      <w:proofErr w:type="gramStart"/>
-      <w:r>
-        <w:rPr>
-          <w:rFonts w:ascii="Calibri Light" w:eastAsia="Cambria" w:hAnsi="Calibri Light" w:cs="Calibri Light"/>
-          <w:bCs/>
-          <w:sz w:val="18"/>
-          <w:szCs w:val="18"/>
-          <w:lang w:val="en-CA"/>
-        </w:rPr>
-        <w:t>address</w:t>
-      </w:r>
-      <w:proofErr w:type="spellEnd"/>
-      <w:r>
-        <w:rPr>
-          <w:rFonts w:ascii="Calibri Light" w:eastAsia="Cambria" w:hAnsi="Calibri Light" w:cs="Calibri Light"/>
-          <w:bCs/>
-          <w:sz w:val="18"/>
-          <w:szCs w:val="18"/>
-          <w:lang w:val="en-CA"/>
-        </w:rPr>
-        <w:t xml:space="preserve"> }</w:t>
-      </w:r>
-      <w:proofErr w:type="gramEnd"/>
-      <w:r>
-        <w:rPr>
-          <w:rFonts w:ascii="Calibri Light" w:eastAsia="Cambria" w:hAnsi="Calibri Light" w:cs="Calibri Light"/>
-          <w:bCs/>
-          <w:sz w:val="18"/>
-          <w:szCs w:val="18"/>
-          <w:lang w:val="en-CA"/>
-        </w:rPr>
-        <w:t xml:space="preserve">} </w:t>
+        <w:t xml:space="preserve">{{ company_address }} </w:t>
       </w:r>
       <w:r>
         <w:rPr>
@@ -192,116 +92,7 @@
           <w:lang w:val="en-CA"/>
         </w:rPr>
         <w:br/>
-      </w:r>
-      <w:proofErr w:type="gramStart"/>
-      <w:r>
-        <w:rPr>
-          <w:rFonts w:ascii="Calibri Light" w:eastAsia="Cambria" w:hAnsi="Calibri Light" w:cs="Calibri Light"/>
-          <w:bCs/>
-          <w:sz w:val="18"/>
-          <w:szCs w:val="18"/>
-          <w:lang w:val="en-CA"/>
-        </w:rPr>
-        <w:t xml:space="preserve">{{ </w:t>
-      </w:r>
-      <w:proofErr w:type="spellStart"/>
-      <w:r>
-        <w:rPr>
-          <w:rFonts w:ascii="Calibri Light" w:eastAsia="Cambria" w:hAnsi="Calibri Light" w:cs="Calibri Light"/>
-          <w:bCs/>
-          <w:sz w:val="18"/>
-          <w:szCs w:val="18"/>
-          <w:lang w:val="en-CA"/>
-        </w:rPr>
-        <w:t>company</w:t>
-      </w:r>
-      <w:proofErr w:type="gramEnd"/>
-      <w:r>
-        <w:rPr>
-          <w:rFonts w:ascii="Calibri Light" w:eastAsia="Cambria" w:hAnsi="Calibri Light" w:cs="Calibri Light"/>
-          <w:bCs/>
-          <w:sz w:val="18"/>
-          <w:szCs w:val="18"/>
-          <w:lang w:val="en-CA"/>
-        </w:rPr>
-        <w:t>_</w:t>
-      </w:r>
-      <w:proofErr w:type="gramStart"/>
-      <w:r>
-        <w:rPr>
-          <w:rFonts w:ascii="Calibri Light" w:eastAsia="Cambria" w:hAnsi="Calibri Light" w:cs="Calibri Light"/>
-          <w:bCs/>
-          <w:sz w:val="18"/>
-          <w:szCs w:val="18"/>
-          <w:lang w:val="en-CA"/>
-        </w:rPr>
-        <w:t>city</w:t>
-      </w:r>
-      <w:proofErr w:type="spellEnd"/>
-      <w:r>
-        <w:rPr>
-          <w:rFonts w:ascii="Calibri Light" w:eastAsia="Cambria" w:hAnsi="Calibri Light" w:cs="Calibri Light"/>
-          <w:bCs/>
-          <w:sz w:val="18"/>
-          <w:szCs w:val="18"/>
-          <w:lang w:val="en-CA"/>
-        </w:rPr>
-        <w:t xml:space="preserve"> }</w:t>
-      </w:r>
-      <w:proofErr w:type="gramEnd"/>
-      <w:r>
-        <w:rPr>
-          <w:rFonts w:ascii="Calibri Light" w:eastAsia="Cambria" w:hAnsi="Calibri Light" w:cs="Calibri Light"/>
-          <w:bCs/>
-          <w:sz w:val="18"/>
-          <w:szCs w:val="18"/>
-          <w:lang w:val="en-CA"/>
-        </w:rPr>
-        <w:t xml:space="preserve">}, </w:t>
-      </w:r>
-      <w:proofErr w:type="gramStart"/>
-      <w:r>
-        <w:rPr>
-          <w:rFonts w:ascii="Calibri Light" w:eastAsia="Cambria" w:hAnsi="Calibri Light" w:cs="Calibri Light"/>
-          <w:bCs/>
-          <w:sz w:val="18"/>
-          <w:szCs w:val="18"/>
-          <w:lang w:val="en-CA"/>
-        </w:rPr>
-        <w:t xml:space="preserve">{{ </w:t>
-      </w:r>
-      <w:proofErr w:type="spellStart"/>
-      <w:r>
-        <w:rPr>
-          <w:rFonts w:ascii="Calibri Light" w:eastAsia="Cambria" w:hAnsi="Calibri Light" w:cs="Calibri Light"/>
-          <w:bCs/>
-          <w:sz w:val="18"/>
-          <w:szCs w:val="18"/>
-          <w:lang w:val="en-CA"/>
-        </w:rPr>
-        <w:t>company</w:t>
-      </w:r>
-      <w:proofErr w:type="gramEnd"/>
-      <w:r>
-        <w:rPr>
-          <w:rFonts w:ascii="Calibri Light" w:eastAsia="Cambria" w:hAnsi="Calibri Light" w:cs="Calibri Light"/>
-          <w:bCs/>
-          <w:sz w:val="18"/>
-          <w:szCs w:val="18"/>
-          <w:lang w:val="en-CA"/>
-        </w:rPr>
-        <w:t>_province</w:t>
-      </w:r>
-      <w:proofErr w:type="spellEnd"/>
-      <w:r>
-        <w:rPr>
-          <w:rFonts w:ascii="Calibri Light" w:eastAsia="Cambria" w:hAnsi="Calibri Light" w:cs="Calibri Light"/>
-          <w:bCs/>
-          <w:sz w:val="18"/>
-          <w:szCs w:val="18"/>
-          <w:lang w:val="en-CA"/>
-        </w:rPr>
-        <w:t xml:space="preserve"> }}</w:t>
+        <w:t>{{ company_city }}, {{ company_province }}</w:t>
       </w:r>
       <w:r>
         <w:rPr>
@@ -312,50 +103,7 @@
           <w:lang w:val="en-CA"/>
         </w:rPr>
         <w:br/>
-      </w:r>
-      <w:proofErr w:type="gramStart"/>
-      <w:r>
-        <w:rPr>
-          <w:rFonts w:ascii="Calibri Light" w:eastAsia="Cambria" w:hAnsi="Calibri Light" w:cs="Calibri Light"/>
-          <w:bCs/>
-          <w:sz w:val="18"/>
-          <w:szCs w:val="18"/>
-          <w:lang w:val="en-CA"/>
-        </w:rPr>
-        <w:t xml:space="preserve">{{ </w:t>
-      </w:r>
-      <w:proofErr w:type="spellStart"/>
-      <w:r>
-        <w:rPr>
-          <w:rFonts w:ascii="Calibri Light" w:eastAsia="Cambria" w:hAnsi="Calibri Light" w:cs="Calibri Light"/>
-          <w:bCs/>
-          <w:sz w:val="18"/>
-          <w:szCs w:val="18"/>
-          <w:lang w:val="en-CA"/>
-        </w:rPr>
-        <w:t>company</w:t>
-      </w:r>
-      <w:proofErr w:type="gramEnd"/>
-      <w:r>
-        <w:rPr>
-          <w:rFonts w:ascii="Calibri Light" w:eastAsia="Cambria" w:hAnsi="Calibri Light" w:cs="Calibri Light"/>
-          <w:bCs/>
-          <w:sz w:val="18"/>
-          <w:szCs w:val="18"/>
-          <w:lang w:val="en-CA"/>
-        </w:rPr>
-        <w:t>_postal</w:t>
-      </w:r>
-      <w:proofErr w:type="spellEnd"/>
-      <w:r>
-        <w:rPr>
-          <w:rFonts w:ascii="Calibri Light" w:eastAsia="Cambria" w:hAnsi="Calibri Light" w:cs="Calibri Light"/>
-          <w:bCs/>
-          <w:sz w:val="18"/>
-          <w:szCs w:val="18"/>
-          <w:lang w:val="en-CA"/>
-        </w:rPr>
-        <w:t xml:space="preserve"> }}</w:t>
+        <w:t>{{ company_postal }}</w:t>
       </w:r>
       <w:r>
         <w:rPr>
@@ -387,71 +135,15 @@
         </w:rPr>
         <w:t xml:space="preserve">Dear </w:t>
       </w:r>
-      <w:proofErr w:type="gramStart"/>
-      <w:r>
-        <w:rPr>
-          <w:rFonts w:ascii="Calibri Light" w:eastAsia="Cambria" w:hAnsi="Calibri Light" w:cs="Calibri Light"/>
-          <w:bCs/>
-          <w:sz w:val="18"/>
-          <w:szCs w:val="18"/>
-          <w:lang w:val="en-CA"/>
-        </w:rPr>
-        <w:t xml:space="preserve">{{ </w:t>
-      </w:r>
-      <w:proofErr w:type="spellStart"/>
-      <w:r>
-        <w:rPr>
-          <w:rFonts w:ascii="Calibri Light" w:eastAsia="Cambria" w:hAnsi="Calibri Light" w:cs="Calibri Light"/>
-          <w:bCs/>
-          <w:sz w:val="18"/>
-          <w:szCs w:val="18"/>
-          <w:lang w:val="en-CA"/>
-        </w:rPr>
-        <w:t>letter</w:t>
-      </w:r>
-      <w:proofErr w:type="gramEnd"/>
-      <w:r>
-        <w:rPr>
-          <w:rFonts w:ascii="Calibri Light" w:eastAsia="Cambria" w:hAnsi="Calibri Light" w:cs="Calibri Light"/>
-          <w:bCs/>
-          <w:sz w:val="18"/>
-          <w:szCs w:val="18"/>
-          <w:lang w:val="en-CA"/>
-        </w:rPr>
-        <w:t>_</w:t>
-      </w:r>
-      <w:proofErr w:type="gramStart"/>
-      <w:r>
-        <w:rPr>
-          <w:rFonts w:ascii="Calibri Light" w:eastAsia="Cambria" w:hAnsi="Calibri Light" w:cs="Calibri Light"/>
-          <w:bCs/>
-          <w:sz w:val="18"/>
-          <w:szCs w:val="18"/>
-          <w:lang w:val="en-CA"/>
-        </w:rPr>
-        <w:t>addressee</w:t>
-      </w:r>
-      <w:proofErr w:type="spellEnd"/>
-      <w:r>
-        <w:rPr>
-          <w:rFonts w:ascii="Calibri Light" w:eastAsia="Cambria" w:hAnsi="Calibri Light" w:cs="Calibri Light"/>
-          <w:bCs/>
-          <w:sz w:val="18"/>
-          <w:szCs w:val="18"/>
-          <w:lang w:val="en-CA"/>
-        </w:rPr>
-        <w:t xml:space="preserve"> }</w:t>
-      </w:r>
-      <w:proofErr w:type="gramEnd"/>
-      <w:r>
-        <w:rPr>
-          <w:rFonts w:ascii="Calibri Light" w:eastAsia="Cambria" w:hAnsi="Calibri Light" w:cs="Calibri Light"/>
-          <w:bCs/>
-          <w:sz w:val="18"/>
-          <w:szCs w:val="18"/>
-          <w:lang w:val="en-CA"/>
-        </w:rPr>
-        <w:t>}</w:t>
+      <w:r>
+        <w:rPr>
+          <w:rFonts w:ascii="Calibri Light" w:eastAsia="Cambria" w:hAnsi="Calibri Light" w:cs="Calibri Light"/>
+          <w:bCs/>
+          <w:sz w:val="18"/>
+          <w:szCs w:val="18"/>
+          <w:lang w:val="en-CA"/>
+        </w:rPr>
+        <w:t>{{ letter_addressee }}</w:t>
       </w:r>
       <w:r>
         <w:rPr>
@@ -554,71 +246,15 @@
         </w:rPr>
         <w:t xml:space="preserve"> </w:t>
       </w:r>
-      <w:proofErr w:type="gramStart"/>
-      <w:r>
-        <w:rPr>
-          <w:rFonts w:ascii="Calibri Light" w:eastAsia="Cambria" w:hAnsi="Calibri Light" w:cs="Calibri Light"/>
-          <w:bCs/>
-          <w:sz w:val="18"/>
-          <w:szCs w:val="18"/>
-          <w:lang w:val="en-CA"/>
-        </w:rPr>
-        <w:t xml:space="preserve">{{ </w:t>
-      </w:r>
-      <w:proofErr w:type="spellStart"/>
-      <w:r>
-        <w:rPr>
-          <w:rFonts w:ascii="Calibri Light" w:eastAsia="Cambria" w:hAnsi="Calibri Light" w:cs="Calibri Light"/>
-          <w:bCs/>
-          <w:sz w:val="18"/>
-          <w:szCs w:val="18"/>
-          <w:lang w:val="en-CA"/>
-        </w:rPr>
-        <w:t>position</w:t>
-      </w:r>
-      <w:proofErr w:type="gramEnd"/>
-      <w:r>
-        <w:rPr>
-          <w:rFonts w:ascii="Calibri Light" w:eastAsia="Cambria" w:hAnsi="Calibri Light" w:cs="Calibri Light"/>
-          <w:bCs/>
-          <w:sz w:val="18"/>
-          <w:szCs w:val="18"/>
-          <w:lang w:val="en-CA"/>
-        </w:rPr>
-        <w:t>_</w:t>
-      </w:r>
-      <w:proofErr w:type="gramStart"/>
-      <w:r>
-        <w:rPr>
-          <w:rFonts w:ascii="Calibri Light" w:eastAsia="Cambria" w:hAnsi="Calibri Light" w:cs="Calibri Light"/>
-          <w:bCs/>
-          <w:sz w:val="18"/>
-          <w:szCs w:val="18"/>
-          <w:lang w:val="en-CA"/>
-        </w:rPr>
-        <w:t>name</w:t>
-      </w:r>
-      <w:proofErr w:type="spellEnd"/>
-      <w:r>
-        <w:rPr>
-          <w:rFonts w:ascii="Calibri Light" w:eastAsia="Cambria" w:hAnsi="Calibri Light" w:cs="Calibri Light"/>
-          <w:bCs/>
-          <w:sz w:val="18"/>
-          <w:szCs w:val="18"/>
-          <w:lang w:val="en-CA"/>
-        </w:rPr>
-        <w:t xml:space="preserve"> }</w:t>
-      </w:r>
-      <w:proofErr w:type="gramEnd"/>
-      <w:r>
-        <w:rPr>
-          <w:rFonts w:ascii="Calibri Light" w:eastAsia="Cambria" w:hAnsi="Calibri Light" w:cs="Calibri Light"/>
-          <w:bCs/>
-          <w:sz w:val="18"/>
-          <w:szCs w:val="18"/>
-          <w:lang w:val="en-CA"/>
-        </w:rPr>
-        <w:t>}</w:t>
+      <w:r>
+        <w:rPr>
+          <w:rFonts w:ascii="Calibri Light" w:eastAsia="Cambria" w:hAnsi="Calibri Light" w:cs="Calibri Light"/>
+          <w:bCs/>
+          <w:sz w:val="18"/>
+          <w:szCs w:val="18"/>
+          <w:lang w:val="en-CA"/>
+        </w:rPr>
+        <w:t>{{ position_name }}</w:t>
       </w:r>
       <w:r>
         <w:rPr>
@@ -640,71 +276,15 @@
         </w:rPr>
         <w:t xml:space="preserve">position with </w:t>
       </w:r>
-      <w:proofErr w:type="gramStart"/>
-      <w:r>
-        <w:rPr>
-          <w:rFonts w:ascii="Calibri Light" w:eastAsia="Cambria" w:hAnsi="Calibri Light" w:cs="Calibri Light"/>
-          <w:bCs/>
-          <w:sz w:val="18"/>
-          <w:szCs w:val="18"/>
-          <w:lang w:val="en-CA"/>
-        </w:rPr>
-        <w:t xml:space="preserve">{{ </w:t>
-      </w:r>
-      <w:proofErr w:type="spellStart"/>
-      <w:r>
-        <w:rPr>
-          <w:rFonts w:ascii="Calibri Light" w:eastAsia="Cambria" w:hAnsi="Calibri Light" w:cs="Calibri Light"/>
-          <w:bCs/>
-          <w:sz w:val="18"/>
-          <w:szCs w:val="18"/>
-          <w:lang w:val="en-CA"/>
-        </w:rPr>
-        <w:t>company</w:t>
-      </w:r>
-      <w:proofErr w:type="gramEnd"/>
-      <w:r>
-        <w:rPr>
-          <w:rFonts w:ascii="Calibri Light" w:eastAsia="Cambria" w:hAnsi="Calibri Light" w:cs="Calibri Light"/>
-          <w:bCs/>
-          <w:sz w:val="18"/>
-          <w:szCs w:val="18"/>
-          <w:lang w:val="en-CA"/>
-        </w:rPr>
-        <w:t>_</w:t>
-      </w:r>
-      <w:proofErr w:type="gramStart"/>
-      <w:r>
-        <w:rPr>
-          <w:rFonts w:ascii="Calibri Light" w:eastAsia="Cambria" w:hAnsi="Calibri Light" w:cs="Calibri Light"/>
-          <w:bCs/>
-          <w:sz w:val="18"/>
-          <w:szCs w:val="18"/>
-          <w:lang w:val="en-CA"/>
-        </w:rPr>
-        <w:t>name</w:t>
-      </w:r>
-      <w:proofErr w:type="spellEnd"/>
-      <w:r>
-        <w:rPr>
-          <w:rFonts w:ascii="Calibri Light" w:eastAsia="Cambria" w:hAnsi="Calibri Light" w:cs="Calibri Light"/>
-          <w:bCs/>
-          <w:sz w:val="18"/>
-          <w:szCs w:val="18"/>
-          <w:lang w:val="en-CA"/>
-        </w:rPr>
-        <w:t xml:space="preserve"> }</w:t>
-      </w:r>
-      <w:proofErr w:type="gramEnd"/>
-      <w:r>
-        <w:rPr>
-          <w:rFonts w:ascii="Calibri Light" w:eastAsia="Cambria" w:hAnsi="Calibri Light" w:cs="Calibri Light"/>
-          <w:bCs/>
-          <w:sz w:val="18"/>
-          <w:szCs w:val="18"/>
-          <w:lang w:val="en-CA"/>
-        </w:rPr>
-        <w:t>}</w:t>
+      <w:r>
+        <w:rPr>
+          <w:rFonts w:ascii="Calibri Light" w:eastAsia="Cambria" w:hAnsi="Calibri Light" w:cs="Calibri Light"/>
+          <w:bCs/>
+          <w:sz w:val="18"/>
+          <w:szCs w:val="18"/>
+          <w:lang w:val="en-CA"/>
+        </w:rPr>
+        <w:t>{{ company_name }}</w:t>
       </w:r>
       <w:r>
         <w:rPr>
@@ -824,103 +404,57 @@
           <w:szCs w:val="18"/>
           <w:lang w:val="en-CA"/>
         </w:rPr>
+        <w:t xml:space="preserve"> {{ company_name }}</w:t>
+      </w:r>
+      <w:r>
+        <w:rPr>
+          <w:rFonts w:ascii="Calibri Light" w:eastAsia="Cambria" w:hAnsi="Calibri Light" w:cs="Calibri Light"/>
+          <w:bCs/>
+          <w:sz w:val="18"/>
+          <w:szCs w:val="18"/>
+          <w:lang w:val="en-CA"/>
+        </w:rPr>
+        <w:t>’s</w:t>
+      </w:r>
+      <w:r>
+        <w:rPr>
+          <w:rFonts w:ascii="Calibri Light" w:eastAsia="Cambria" w:hAnsi="Calibri Light" w:cs="Calibri Light"/>
+          <w:bCs/>
+          <w:sz w:val="18"/>
+          <w:szCs w:val="18"/>
+          <w:lang w:val="en-CA"/>
+        </w:rPr>
+        <w:t xml:space="preserve"> mission </w:t>
+      </w:r>
+      <w:r>
+        <w:rPr>
+          <w:rFonts w:ascii="Calibri Light" w:eastAsia="Cambria" w:hAnsi="Calibri Light" w:cs="Calibri Light"/>
+          <w:bCs/>
+          <w:sz w:val="18"/>
+          <w:szCs w:val="18"/>
+          <w:lang w:val="en-CA"/>
+        </w:rPr>
+        <w:t>in</w:t>
+      </w:r>
+      <w:r>
+        <w:rPr>
+          <w:rFonts w:ascii="Calibri Light" w:eastAsia="Cambria" w:hAnsi="Calibri Light" w:cs="Calibri Light"/>
+          <w:bCs/>
+          <w:sz w:val="18"/>
+          <w:szCs w:val="18"/>
+          <w:lang w:val="en-CA"/>
+        </w:rPr>
         <w:t xml:space="preserve"> </w:t>
       </w:r>
-      <w:proofErr w:type="gramStart"/>
-      <w:r>
-        <w:rPr>
-          <w:rFonts w:ascii="Calibri Light" w:eastAsia="Cambria" w:hAnsi="Calibri Light" w:cs="Calibri Light"/>
-          <w:bCs/>
-          <w:sz w:val="18"/>
-          <w:szCs w:val="18"/>
-          <w:lang w:val="en-CA"/>
-        </w:rPr>
-        <w:t xml:space="preserve">{{ </w:t>
-      </w:r>
-      <w:proofErr w:type="spellStart"/>
-      <w:r>
-        <w:rPr>
-          <w:rFonts w:ascii="Calibri Light" w:eastAsia="Cambria" w:hAnsi="Calibri Light" w:cs="Calibri Light"/>
-          <w:bCs/>
-          <w:sz w:val="18"/>
-          <w:szCs w:val="18"/>
-          <w:lang w:val="en-CA"/>
-        </w:rPr>
-        <w:t>company</w:t>
-      </w:r>
-      <w:proofErr w:type="gramEnd"/>
-      <w:r>
-        <w:rPr>
-          <w:rFonts w:ascii="Calibri Light" w:eastAsia="Cambria" w:hAnsi="Calibri Light" w:cs="Calibri Light"/>
-          <w:bCs/>
-          <w:sz w:val="18"/>
-          <w:szCs w:val="18"/>
-          <w:lang w:val="en-CA"/>
-        </w:rPr>
-        <w:t>_</w:t>
-      </w:r>
-      <w:proofErr w:type="gramStart"/>
-      <w:r>
-        <w:rPr>
-          <w:rFonts w:ascii="Calibri Light" w:eastAsia="Cambria" w:hAnsi="Calibri Light" w:cs="Calibri Light"/>
-          <w:bCs/>
-          <w:sz w:val="18"/>
-          <w:szCs w:val="18"/>
-          <w:lang w:val="en-CA"/>
-        </w:rPr>
-        <w:t>name</w:t>
-      </w:r>
-      <w:proofErr w:type="spellEnd"/>
-      <w:r>
-        <w:rPr>
-          <w:rFonts w:ascii="Calibri Light" w:eastAsia="Cambria" w:hAnsi="Calibri Light" w:cs="Calibri Light"/>
-          <w:bCs/>
-          <w:sz w:val="18"/>
-          <w:szCs w:val="18"/>
-          <w:lang w:val="en-CA"/>
-        </w:rPr>
-        <w:t xml:space="preserve"> }}</w:t>
-      </w:r>
-      <w:r>
-        <w:rPr>
-          <w:rFonts w:ascii="Calibri Light" w:eastAsia="Cambria" w:hAnsi="Calibri Light" w:cs="Calibri Light"/>
-          <w:bCs/>
-          <w:sz w:val="18"/>
-          <w:szCs w:val="18"/>
-          <w:lang w:val="en-CA"/>
-        </w:rPr>
-        <w:t>’</w:t>
-      </w:r>
-      <w:proofErr w:type="gramEnd"/>
-      <w:r>
-        <w:rPr>
-          <w:rFonts w:ascii="Calibri Light" w:eastAsia="Cambria" w:hAnsi="Calibri Light" w:cs="Calibri Light"/>
-          <w:bCs/>
-          <w:sz w:val="18"/>
-          <w:szCs w:val="18"/>
-          <w:lang w:val="en-CA"/>
-        </w:rPr>
-        <w:t>s</w:t>
-      </w:r>
-      <w:r>
-        <w:rPr>
-          <w:rFonts w:ascii="Calibri Light" w:eastAsia="Cambria" w:hAnsi="Calibri Light" w:cs="Calibri Light"/>
-          <w:bCs/>
-          <w:sz w:val="18"/>
-          <w:szCs w:val="18"/>
-          <w:lang w:val="en-CA"/>
-        </w:rPr>
-        <w:t xml:space="preserve"> mission </w:t>
-      </w:r>
-      <w:r>
-        <w:rPr>
-          <w:rFonts w:ascii="Calibri Light" w:eastAsia="Cambria" w:hAnsi="Calibri Light" w:cs="Calibri Light"/>
-          <w:bCs/>
-          <w:sz w:val="18"/>
-          <w:szCs w:val="18"/>
-          <w:lang w:val="en-CA"/>
-        </w:rPr>
-        <w:t>in</w:t>
+      <w:r>
+        <w:rPr>
+          <w:rFonts w:ascii="Calibri Light" w:eastAsia="Cambria" w:hAnsi="Calibri Light" w:cs="Calibri Light"/>
+          <w:bCs/>
+          <w:sz w:val="18"/>
+          <w:szCs w:val="18"/>
+          <w:lang w:val="en-CA"/>
+        </w:rPr>
+        <w:t>{{ mission_statement }}</w:t>
       </w:r>
       <w:r>
         <w:rPr>
@@ -932,71 +466,35 @@
         </w:rPr>
         <w:t xml:space="preserve"> </w:t>
       </w:r>
-      <w:proofErr w:type="gramStart"/>
-      <w:r>
-        <w:rPr>
-          <w:rFonts w:ascii="Calibri Light" w:eastAsia="Cambria" w:hAnsi="Calibri Light" w:cs="Calibri Light"/>
-          <w:bCs/>
-          <w:sz w:val="18"/>
-          <w:szCs w:val="18"/>
-          <w:lang w:val="en-CA"/>
-        </w:rPr>
-        <w:t xml:space="preserve">{{ </w:t>
-      </w:r>
-      <w:proofErr w:type="spellStart"/>
-      <w:r>
-        <w:rPr>
-          <w:rFonts w:ascii="Calibri Light" w:eastAsia="Cambria" w:hAnsi="Calibri Light" w:cs="Calibri Light"/>
-          <w:bCs/>
-          <w:sz w:val="18"/>
-          <w:szCs w:val="18"/>
-          <w:lang w:val="en-CA"/>
-        </w:rPr>
-        <w:t>mission</w:t>
-      </w:r>
-      <w:proofErr w:type="gramEnd"/>
-      <w:r>
-        <w:rPr>
-          <w:rFonts w:ascii="Calibri Light" w:eastAsia="Cambria" w:hAnsi="Calibri Light" w:cs="Calibri Light"/>
-          <w:bCs/>
-          <w:sz w:val="18"/>
-          <w:szCs w:val="18"/>
-          <w:lang w:val="en-CA"/>
-        </w:rPr>
-        <w:t>_</w:t>
-      </w:r>
-      <w:proofErr w:type="gramStart"/>
-      <w:r>
-        <w:rPr>
-          <w:rFonts w:ascii="Calibri Light" w:eastAsia="Cambria" w:hAnsi="Calibri Light" w:cs="Calibri Light"/>
-          <w:bCs/>
-          <w:sz w:val="18"/>
-          <w:szCs w:val="18"/>
-          <w:lang w:val="en-CA"/>
-        </w:rPr>
-        <w:t>statement</w:t>
-      </w:r>
-      <w:proofErr w:type="spellEnd"/>
-      <w:r>
-        <w:rPr>
-          <w:rFonts w:ascii="Calibri Light" w:eastAsia="Cambria" w:hAnsi="Calibri Light" w:cs="Calibri Light"/>
-          <w:bCs/>
-          <w:sz w:val="18"/>
-          <w:szCs w:val="18"/>
-          <w:lang w:val="en-CA"/>
-        </w:rPr>
-        <w:t xml:space="preserve"> }</w:t>
-      </w:r>
-      <w:proofErr w:type="gramEnd"/>
-      <w:r>
-        <w:rPr>
-          <w:rFonts w:ascii="Calibri Light" w:eastAsia="Cambria" w:hAnsi="Calibri Light" w:cs="Calibri Light"/>
-          <w:bCs/>
-          <w:sz w:val="18"/>
-          <w:szCs w:val="18"/>
-          <w:lang w:val="en-CA"/>
-        </w:rPr>
-        <w:t>}</w:t>
+      <w:r>
+        <w:rPr>
+          <w:rFonts w:ascii="Calibri Light" w:eastAsia="Cambria" w:hAnsi="Calibri Light" w:cs="Calibri Light"/>
+          <w:bCs/>
+          <w:sz w:val="18"/>
+          <w:szCs w:val="18"/>
+          <w:lang w:val="en-CA"/>
+        </w:rPr>
+        <w:t xml:space="preserve">strongly resonates with my own values in utilizing technology to help serve local communities, while making positive contributions to society through data-driven solutions. </w:t>
+      </w:r>
+      <w:r>
+        <w:rPr>
+          <w:rFonts w:ascii="Calibri Light" w:eastAsia="Cambria" w:hAnsi="Calibri Light" w:cs="Calibri Light"/>
+          <w:bCs/>
+          <w:sz w:val="18"/>
+          <w:szCs w:val="18"/>
+          <w:lang w:val="en-CA"/>
+        </w:rPr>
+        <w:t>Thus, c</w:t>
+      </w:r>
+      <w:r>
+        <w:rPr>
+          <w:rFonts w:ascii="Calibri Light" w:eastAsia="Cambria" w:hAnsi="Calibri Light" w:cs="Calibri Light"/>
+          <w:bCs/>
+          <w:sz w:val="18"/>
+          <w:szCs w:val="18"/>
+          <w:lang w:val="en-CA"/>
+        </w:rPr>
+        <w:t>ombined with my</w:t>
       </w:r>
       <w:r>
         <w:rPr>
@@ -1016,46 +514,6 @@
           <w:szCs w:val="18"/>
           <w:lang w:val="en-CA"/>
         </w:rPr>
-        <w:t xml:space="preserve">strongly resonates with my own values in utilizing technology to help serve local communities, while making positive contributions to society through data-driven solutions. </w:t>
-      </w:r>
-      <w:r>
-        <w:rPr>
-          <w:rFonts w:ascii="Calibri Light" w:eastAsia="Cambria" w:hAnsi="Calibri Light" w:cs="Calibri Light"/>
-          <w:bCs/>
-          <w:sz w:val="18"/>
-          <w:szCs w:val="18"/>
-          <w:lang w:val="en-CA"/>
-        </w:rPr>
-        <w:t>Thus, c</w:t>
-      </w:r>
-      <w:r>
-        <w:rPr>
-          <w:rFonts w:ascii="Calibri Light" w:eastAsia="Cambria" w:hAnsi="Calibri Light" w:cs="Calibri Light"/>
-          <w:bCs/>
-          <w:sz w:val="18"/>
-          <w:szCs w:val="18"/>
-          <w:lang w:val="en-CA"/>
-        </w:rPr>
-        <w:t>ombined with my</w:t>
-      </w:r>
-      <w:r>
-        <w:rPr>
-          <w:rFonts w:ascii="Calibri Light" w:eastAsia="Cambria" w:hAnsi="Calibri Light" w:cs="Calibri Light"/>
-          <w:bCs/>
-          <w:sz w:val="18"/>
-          <w:szCs w:val="18"/>
-          <w:lang w:val="en-CA"/>
-        </w:rPr>
-        <w:t xml:space="preserve"> </w:t>
-      </w:r>
-      <w:r>
-        <w:rPr>
-          <w:rFonts w:ascii="Calibri Light" w:eastAsia="Cambria" w:hAnsi="Calibri Light" w:cs="Calibri Light"/>
-          <w:bCs/>
-          <w:sz w:val="18"/>
-          <w:szCs w:val="18"/>
-          <w:lang w:val="en-CA"/>
-        </w:rPr>
         <w:t xml:space="preserve">rapidly improving data-related skills and a </w:t>
       </w:r>
       <w:r>
@@ -1098,81 +556,25 @@
         </w:rPr>
         <w:t xml:space="preserve">the </w:t>
       </w:r>
-      <w:proofErr w:type="gramStart"/>
-      <w:r>
-        <w:rPr>
-          <w:rFonts w:ascii="Calibri Light" w:eastAsia="Cambria" w:hAnsi="Calibri Light" w:cs="Calibri Light"/>
-          <w:bCs/>
-          <w:sz w:val="18"/>
-          <w:szCs w:val="18"/>
-          <w:lang w:val="en-CA"/>
-        </w:rPr>
-        <w:t xml:space="preserve">{{ </w:t>
-      </w:r>
-      <w:proofErr w:type="spellStart"/>
-      <w:r>
-        <w:rPr>
-          <w:rFonts w:ascii="Calibri Light" w:eastAsia="Cambria" w:hAnsi="Calibri Light" w:cs="Calibri Light"/>
-          <w:bCs/>
-          <w:sz w:val="18"/>
-          <w:szCs w:val="18"/>
-          <w:lang w:val="en-CA"/>
-        </w:rPr>
-        <w:t>company</w:t>
-      </w:r>
-      <w:proofErr w:type="gramEnd"/>
-      <w:r>
-        <w:rPr>
-          <w:rFonts w:ascii="Calibri Light" w:eastAsia="Cambria" w:hAnsi="Calibri Light" w:cs="Calibri Light"/>
-          <w:bCs/>
-          <w:sz w:val="18"/>
-          <w:szCs w:val="18"/>
-          <w:lang w:val="en-CA"/>
-        </w:rPr>
-        <w:t>_</w:t>
-      </w:r>
-      <w:proofErr w:type="gramStart"/>
-      <w:r>
-        <w:rPr>
-          <w:rFonts w:ascii="Calibri Light" w:eastAsia="Cambria" w:hAnsi="Calibri Light" w:cs="Calibri Light"/>
-          <w:bCs/>
-          <w:sz w:val="18"/>
-          <w:szCs w:val="18"/>
-          <w:lang w:val="en-CA"/>
-        </w:rPr>
-        <w:t>name</w:t>
-      </w:r>
-      <w:proofErr w:type="spellEnd"/>
-      <w:r>
-        <w:rPr>
-          <w:rFonts w:ascii="Calibri Light" w:eastAsia="Cambria" w:hAnsi="Calibri Light" w:cs="Calibri Light"/>
-          <w:bCs/>
-          <w:sz w:val="18"/>
-          <w:szCs w:val="18"/>
-          <w:lang w:val="en-CA"/>
-        </w:rPr>
-        <w:t xml:space="preserve"> }}</w:t>
-      </w:r>
-      <w:r>
-        <w:rPr>
-          <w:rFonts w:ascii="Calibri Light" w:eastAsia="Cambria" w:hAnsi="Calibri Light" w:cs="Calibri Light"/>
-          <w:bCs/>
-          <w:sz w:val="18"/>
-          <w:szCs w:val="18"/>
-          <w:lang w:val="en-CA"/>
-        </w:rPr>
-        <w:t>’</w:t>
-      </w:r>
-      <w:proofErr w:type="gramEnd"/>
-      <w:r>
-        <w:rPr>
-          <w:rFonts w:ascii="Calibri Light" w:eastAsia="Cambria" w:hAnsi="Calibri Light" w:cs="Calibri Light"/>
-          <w:bCs/>
-          <w:sz w:val="18"/>
-          <w:szCs w:val="18"/>
-          <w:lang w:val="en-CA"/>
-        </w:rPr>
-        <w:t xml:space="preserve">s </w:t>
+      <w:r>
+        <w:rPr>
+          <w:rFonts w:ascii="Calibri Light" w:eastAsia="Cambria" w:hAnsi="Calibri Light" w:cs="Calibri Light"/>
+          <w:bCs/>
+          <w:sz w:val="18"/>
+          <w:szCs w:val="18"/>
+          <w:lang w:val="en-CA"/>
+        </w:rPr>
+        <w:t>{{ company_name }}</w:t>
+      </w:r>
+      <w:r>
+        <w:rPr>
+          <w:rFonts w:ascii="Calibri Light" w:eastAsia="Cambria" w:hAnsi="Calibri Light" w:cs="Calibri Light"/>
+          <w:bCs/>
+          <w:sz w:val="18"/>
+          <w:szCs w:val="18"/>
+          <w:lang w:val="en-CA"/>
+        </w:rPr>
+        <w:t xml:space="preserve">’s </w:t>
       </w:r>
       <w:r>
         <w:rPr>
@@ -1229,187 +631,7 @@
           <w:sz w:val="18"/>
           <w:szCs w:val="18"/>
         </w:rPr>
-        <w:t xml:space="preserve">For example, through the Google Data Analytics Certificate program, I learnt the foundations of exploratory data analysis, including fundamentals of manipulating data in Excel and SQL through </w:t>
-      </w:r>
-      <w:proofErr w:type="spellStart"/>
-      <w:r>
-        <w:rPr>
-          <w:rFonts w:ascii="Calibri Light" w:hAnsi="Calibri Light" w:cs="Calibri Light"/>
-          <w:sz w:val="18"/>
-          <w:szCs w:val="18"/>
-        </w:rPr>
-        <w:t>BigQuery</w:t>
-      </w:r>
-      <w:proofErr w:type="spellEnd"/>
-      <w:r>
-        <w:rPr>
-          <w:rFonts w:ascii="Calibri Light" w:hAnsi="Calibri Light" w:cs="Calibri Light"/>
-          <w:sz w:val="18"/>
-          <w:szCs w:val="18"/>
-        </w:rPr>
-        <w:t xml:space="preserve">, and was introduced to visualization platforms such as Tableau and Power BI. I further expanded my analytical skills through my enrollment in an introductory data science course through my curriculum, where I used R and </w:t>
-      </w:r>
-      <w:proofErr w:type="spellStart"/>
-      <w:r>
-        <w:rPr>
-          <w:rFonts w:ascii="Calibri Light" w:hAnsi="Calibri Light" w:cs="Calibri Light"/>
-          <w:sz w:val="18"/>
-          <w:szCs w:val="18"/>
-        </w:rPr>
-        <w:t>Jupyter</w:t>
-      </w:r>
-      <w:proofErr w:type="spellEnd"/>
-      <w:r>
-        <w:rPr>
-          <w:rFonts w:ascii="Calibri Light" w:hAnsi="Calibri Light" w:cs="Calibri Light"/>
-          <w:sz w:val="18"/>
-          <w:szCs w:val="18"/>
-        </w:rPr>
-        <w:t xml:space="preserve"> Notebooks to read, transform and clean a dataset of over 1, 500 records for the Pacific Laboratory for Artificial Intelligence. Here, I visualized the data and supported the development of a K-NN regression model to uncover trends from the data. Outside of the classroom, I have also worked in small Agile-style teams using Git and GitHub for version control during hackathons, successfully engineering the backend logic using MongoDB for numerous full-stack applications, and also swiftly learnt how to integrate the </w:t>
-      </w:r>
-      <w:proofErr w:type="spellStart"/>
-      <w:r>
-        <w:rPr>
-          <w:rFonts w:ascii="Calibri Light" w:hAnsi="Calibri Light" w:cs="Calibri Light"/>
-          <w:sz w:val="18"/>
-          <w:szCs w:val="18"/>
-        </w:rPr>
-        <w:t>Groq</w:t>
-      </w:r>
-      <w:proofErr w:type="spellEnd"/>
-      <w:r>
-        <w:rPr>
-          <w:rFonts w:ascii="Calibri Light" w:hAnsi="Calibri Light" w:cs="Calibri Light"/>
-          <w:sz w:val="18"/>
-          <w:szCs w:val="18"/>
-        </w:rPr>
-        <w:t xml:space="preserve"> A.I. API for immediate response rendering – the latter experience was my first foray into implementing A.I. technologies into my projects, and had sparked my personal interest in practical A.I. usage and backend-to-frontend coordination. Academically, I also developed </w:t>
-      </w:r>
-      <w:proofErr w:type="spellStart"/>
-      <w:r>
-        <w:rPr>
-          <w:rFonts w:ascii="Calibri Light" w:hAnsi="Calibri Light" w:cs="Calibri Light"/>
-          <w:sz w:val="18"/>
-          <w:szCs w:val="18"/>
-        </w:rPr>
-        <w:t>DailySips</w:t>
-      </w:r>
-      <w:proofErr w:type="spellEnd"/>
-      <w:r>
-        <w:rPr>
-          <w:rFonts w:ascii="Calibri Light" w:hAnsi="Calibri Light" w:cs="Calibri Light"/>
-          <w:sz w:val="18"/>
-          <w:szCs w:val="18"/>
-        </w:rPr>
-        <w:t>, a Java-based beverage tracker. Here, I built my applications</w:t>
-      </w:r>
-      <w:proofErr w:type="gramStart"/>
-      <w:r>
-        <w:rPr>
-          <w:rFonts w:ascii="Calibri Light" w:hAnsi="Calibri Light" w:cs="Calibri Light"/>
-          <w:sz w:val="18"/>
-          <w:szCs w:val="18"/>
-        </w:rPr>
-        <w:t>’ user</w:t>
-      </w:r>
-      <w:proofErr w:type="gramEnd"/>
-      <w:r>
-        <w:rPr>
-          <w:rFonts w:ascii="Calibri Light" w:hAnsi="Calibri Light" w:cs="Calibri Light"/>
-          <w:sz w:val="18"/>
-          <w:szCs w:val="18"/>
-        </w:rPr>
-        <w:t xml:space="preserve"> interface entirely through Java Swing, learnt how to implement JSON-based data persistence, writing rigorous JUnit tests to validate my application’s </w:t>
-      </w:r>
-      <w:proofErr w:type="spellStart"/>
-      <w:r>
-        <w:rPr>
-          <w:rFonts w:ascii="Calibri Light" w:hAnsi="Calibri Light" w:cs="Calibri Light"/>
-          <w:sz w:val="18"/>
-          <w:szCs w:val="18"/>
-        </w:rPr>
-        <w:t>behaviour</w:t>
-      </w:r>
-      <w:proofErr w:type="spellEnd"/>
-      <w:r>
-        <w:rPr>
-          <w:rFonts w:ascii="Calibri Light" w:hAnsi="Calibri Light" w:cs="Calibri Light"/>
-          <w:sz w:val="18"/>
-          <w:szCs w:val="18"/>
-        </w:rPr>
-        <w:t xml:space="preserve"> and improve code robustness. This not only sharpened my technical and analytical skills, but highlighted the importance of detail-oriented thinking, and structured problem-solving — all essential in test planning, execution, and reporting. </w:t>
-      </w:r>
-      <w:proofErr w:type="gramStart"/>
-      <w:r>
-        <w:rPr>
-          <w:rFonts w:ascii="Calibri Light" w:hAnsi="Calibri Light" w:cs="Calibri Light"/>
-          <w:sz w:val="18"/>
-          <w:szCs w:val="18"/>
-        </w:rPr>
-        <w:t>All of</w:t>
-      </w:r>
-      <w:proofErr w:type="gramEnd"/>
-      <w:r>
-        <w:rPr>
-          <w:rFonts w:ascii="Calibri Light" w:hAnsi="Calibri Light" w:cs="Calibri Light"/>
-          <w:sz w:val="18"/>
-          <w:szCs w:val="18"/>
-        </w:rPr>
-        <w:t xml:space="preserve"> these experiences not only </w:t>
-      </w:r>
-      <w:proofErr w:type="gramStart"/>
-      <w:r>
-        <w:rPr>
-          <w:rFonts w:ascii="Calibri Light" w:hAnsi="Calibri Light" w:cs="Calibri Light"/>
-          <w:sz w:val="18"/>
-          <w:szCs w:val="18"/>
-        </w:rPr>
-        <w:t>highlights</w:t>
-      </w:r>
-      <w:proofErr w:type="gramEnd"/>
-      <w:r>
-        <w:rPr>
-          <w:rFonts w:ascii="Calibri Light" w:hAnsi="Calibri Light" w:cs="Calibri Light"/>
-          <w:sz w:val="18"/>
-          <w:szCs w:val="18"/>
-        </w:rPr>
-        <w:t xml:space="preserve"> my technical </w:t>
-      </w:r>
-      <w:proofErr w:type="gramStart"/>
-      <w:r>
-        <w:rPr>
-          <w:rFonts w:ascii="Calibri Light" w:hAnsi="Calibri Light" w:cs="Calibri Light"/>
-          <w:sz w:val="18"/>
-          <w:szCs w:val="18"/>
-        </w:rPr>
-        <w:t>growth, but</w:t>
-      </w:r>
-      <w:proofErr w:type="gramEnd"/>
-      <w:r>
-        <w:rPr>
-          <w:rFonts w:ascii="Calibri Light" w:hAnsi="Calibri Light" w:cs="Calibri Light"/>
-          <w:sz w:val="18"/>
-          <w:szCs w:val="18"/>
-        </w:rPr>
-        <w:t xml:space="preserve"> also showcases my </w:t>
-      </w:r>
-      <w:proofErr w:type="gramStart"/>
-      <w:r>
-        <w:rPr>
-          <w:rFonts w:ascii="Calibri Light" w:hAnsi="Calibri Light" w:cs="Calibri Light"/>
-          <w:sz w:val="18"/>
-          <w:szCs w:val="18"/>
-        </w:rPr>
-        <w:t>passions</w:t>
-      </w:r>
-      <w:proofErr w:type="gramEnd"/>
-      <w:r>
-        <w:rPr>
-          <w:rFonts w:ascii="Calibri Light" w:hAnsi="Calibri Light" w:cs="Calibri Light"/>
-          <w:sz w:val="18"/>
-          <w:szCs w:val="18"/>
-        </w:rPr>
-        <w:t xml:space="preserve"> for applying software and data tools to real-world problems.</w:t>
+        <w:t>For example, through the Google Data Analytics Certificate program, I learnt the foundations of exploratory data analysis, including fundamentals of manipulating data in Excel and SQL through BigQuery, and was introduced to visualization platforms such as Tableau and Power BI. I further expanded my analytical skills through my enrollment in an introductory data science course through my curriculum, where I used R and Jupyter Notebooks to read, transform and clean a dataset of over 1, 500 records for the Pacific Laboratory for Artificial Intelligence. Here, I visualized the data and supported the development of a K-NN regression model to uncover trends from the data. Outside of the classroom, I have also worked in small Agile-style teams using Git and GitHub for version control during hackathons, successfully engineering the backend logic using MongoDB for numerous full-stack applications, and also swiftly learnt how to integrate the Groq A.I. API for immediate response rendering – the latter experience was my first foray into implementing A.I. technologies into my projects, and had sparked my personal interest in practical A.I. usage and backend-to-frontend coordination. Academically, I also developed DailySips, a Java-based beverage tracker. Here, I built my applications’ user interface entirely through Java Swing, learnt how to implement JSON-based data persistence, writing rigorous JUnit tests to validate my application’s behaviour and improve code robustness. This not only sharpened my technical and analytical skills, but highlighted the importance of detail-oriented thinking, and structured problem-solving — all essential in test planning, execution, and reporting. All of these experiences not only highlights my technical growth, but also showcases my passions for applying software and data tools to real-world problems.</w:t>
       </w:r>
     </w:p>
     <w:p>
@@ -1671,105 +893,31 @@
         </w:rPr>
         <w:t xml:space="preserve"> </w:t>
       </w:r>
-      <w:proofErr w:type="gramStart"/>
-      <w:r>
-        <w:rPr>
-          <w:rFonts w:ascii="Calibri Light" w:eastAsia="Cambria" w:hAnsi="Calibri Light" w:cs="Calibri Light"/>
-          <w:bCs/>
-          <w:sz w:val="18"/>
-          <w:szCs w:val="18"/>
-          <w:lang w:val="en-CA"/>
-        </w:rPr>
-        <w:t xml:space="preserve">{{ </w:t>
-      </w:r>
-      <w:proofErr w:type="spellStart"/>
-      <w:r>
-        <w:rPr>
-          <w:rFonts w:ascii="Calibri Light" w:eastAsia="Cambria" w:hAnsi="Calibri Light" w:cs="Calibri Light"/>
-          <w:bCs/>
-          <w:sz w:val="18"/>
-          <w:szCs w:val="18"/>
-          <w:lang w:val="en-CA"/>
-        </w:rPr>
-        <w:t>company</w:t>
-      </w:r>
-      <w:proofErr w:type="gramEnd"/>
-      <w:r>
-        <w:rPr>
-          <w:rFonts w:ascii="Calibri Light" w:eastAsia="Cambria" w:hAnsi="Calibri Light" w:cs="Calibri Light"/>
-          <w:bCs/>
-          <w:sz w:val="18"/>
-          <w:szCs w:val="18"/>
-          <w:lang w:val="en-CA"/>
-        </w:rPr>
-        <w:t>_</w:t>
-      </w:r>
-      <w:proofErr w:type="gramStart"/>
-      <w:r>
-        <w:rPr>
-          <w:rFonts w:ascii="Calibri Light" w:eastAsia="Cambria" w:hAnsi="Calibri Light" w:cs="Calibri Light"/>
-          <w:bCs/>
-          <w:sz w:val="18"/>
-          <w:szCs w:val="18"/>
-          <w:lang w:val="en-CA"/>
-        </w:rPr>
-        <w:t>name</w:t>
-      </w:r>
-      <w:proofErr w:type="spellEnd"/>
-      <w:r>
-        <w:rPr>
-          <w:rFonts w:ascii="Calibri Light" w:eastAsia="Cambria" w:hAnsi="Calibri Light" w:cs="Calibri Light"/>
-          <w:bCs/>
-          <w:sz w:val="18"/>
-          <w:szCs w:val="18"/>
-          <w:lang w:val="en-CA"/>
-        </w:rPr>
-        <w:t xml:space="preserve"> }</w:t>
-      </w:r>
-      <w:proofErr w:type="gramEnd"/>
-      <w:r>
-        <w:rPr>
-          <w:rFonts w:ascii="Calibri Light" w:eastAsia="Cambria" w:hAnsi="Calibri Light" w:cs="Calibri Light"/>
-          <w:bCs/>
-          <w:sz w:val="18"/>
-          <w:szCs w:val="18"/>
-          <w:lang w:val="en-CA"/>
-        </w:rPr>
-        <w:t>}</w:t>
-      </w:r>
-      <w:r>
-        <w:rPr>
-          <w:rFonts w:ascii="Calibri Light" w:hAnsi="Calibri Light" w:cs="Calibri Light"/>
-          <w:sz w:val="18"/>
-          <w:szCs w:val="18"/>
-        </w:rPr>
-        <w:t xml:space="preserve"> to support your mission and </w:t>
-      </w:r>
-      <w:proofErr w:type="gramStart"/>
-      <w:r>
-        <w:rPr>
-          <w:rFonts w:ascii="Calibri Light" w:hAnsi="Calibri Light" w:cs="Calibri Light"/>
-          <w:sz w:val="18"/>
-          <w:szCs w:val="18"/>
-        </w:rPr>
-        <w:t xml:space="preserve">initiatives, </w:t>
-      </w:r>
-      <w:r>
-        <w:rPr>
-          <w:rFonts w:ascii="Calibri Light" w:hAnsi="Calibri Light" w:cs="Calibri Light"/>
-          <w:sz w:val="18"/>
-          <w:szCs w:val="18"/>
-        </w:rPr>
-        <w:t>and</w:t>
-      </w:r>
-      <w:proofErr w:type="gramEnd"/>
-      <w:r>
-        <w:rPr>
-          <w:rFonts w:ascii="Calibri Light" w:hAnsi="Calibri Light" w:cs="Calibri Light"/>
-          <w:sz w:val="18"/>
-          <w:szCs w:val="18"/>
-        </w:rPr>
-        <w:t xml:space="preserve"> am motivated to help create</w:t>
+      <w:r>
+        <w:rPr>
+          <w:rFonts w:ascii="Calibri Light" w:eastAsia="Cambria" w:hAnsi="Calibri Light" w:cs="Calibri Light"/>
+          <w:bCs/>
+          <w:sz w:val="18"/>
+          <w:szCs w:val="18"/>
+          <w:lang w:val="en-CA"/>
+        </w:rPr>
+        <w:t>{{ company_name }}</w:t>
+      </w:r>
+      <w:r>
+        <w:rPr>
+          <w:rFonts w:ascii="Calibri Light" w:hAnsi="Calibri Light" w:cs="Calibri Light"/>
+          <w:sz w:val="18"/>
+          <w:szCs w:val="18"/>
+        </w:rPr>
+        <w:t xml:space="preserve"> to support your mission and initiatives, </w:t>
+      </w:r>
+      <w:r>
+        <w:rPr>
+          <w:rFonts w:ascii="Calibri Light" w:hAnsi="Calibri Light" w:cs="Calibri Light"/>
+          <w:sz w:val="18"/>
+          <w:szCs w:val="18"/>
+        </w:rPr>
+        <w:t>and am motivated to help create</w:t>
       </w:r>
       <w:r>
         <w:rPr>

</xml_diff>

<commit_message>
DS cover letter templates now fully updated
</commit_message>
<xml_diff>
--- a/DataAnalyst_CoverLetterTemplate.docx
+++ b/DataAnalyst_CoverLetterTemplate.docx
@@ -364,17 +364,17 @@
           <w:szCs w:val="18"/>
           <w:lang w:val="en-CA"/>
         </w:rPr>
-        <w:t xml:space="preserve">, especially </w:t>
-      </w:r>
-      <w:r>
-        <w:rPr>
-          <w:rFonts w:ascii="Calibri Light" w:eastAsia="Cambria" w:hAnsi="Calibri Light" w:cs="Calibri Light"/>
-          <w:bCs/>
-          <w:sz w:val="18"/>
-          <w:szCs w:val="18"/>
-          <w:lang w:val="en-CA"/>
-        </w:rPr>
-        <w:t>through the proper processing and handling of</w:t>
+        <w:t xml:space="preserve"> through</w:t>
+      </w:r>
+      <w:r>
+        <w:rPr>
+          <w:rFonts w:ascii="Calibri Light" w:eastAsia="Cambria" w:hAnsi="Calibri Light" w:cs="Calibri Light"/>
+          <w:bCs/>
+          <w:sz w:val="18"/>
+          <w:szCs w:val="18"/>
+          <w:lang w:val="en-CA"/>
+        </w:rPr>
+        <w:t xml:space="preserve"> insights generated from</w:t>
       </w:r>
       <w:r>
         <w:rPr>
@@ -623,15 +623,39 @@
           <w:szCs w:val="18"/>
           <w:lang w:val="en-CA"/>
         </w:rPr>
-        <w:t xml:space="preserve">Admittedly, my technological skillset and familiarity with advanced data-related libraries is still growing – however, I bring a strong foundation in both data science and front-end development and am actively bridging my knowledge gaps through self-directed learning. </w:t>
-      </w:r>
-      <w:r>
-        <w:rPr>
-          <w:rFonts w:ascii="Calibri Light" w:hAnsi="Calibri Light" w:cs="Calibri Light"/>
-          <w:sz w:val="18"/>
-          <w:szCs w:val="18"/>
-        </w:rPr>
-        <w:t>For example, through the Google Data Analytics Certificate program, I learnt the foundations of exploratory data analysis, including fundamentals of manipulating data in Excel and SQL through BigQuery, and was introduced to visualization platforms such as Tableau and Power BI. I further expanded my analytical skills through my enrollment in an introductory data science course through my curriculum, where I used R and Jupyter Notebooks to read, transform and clean a dataset of over 1, 500 records for the Pacific Laboratory for Artificial Intelligence. Here, I visualized the data and supported the development of a K-NN regression model to uncover trends from the data. Outside of the classroom, I have also worked in small Agile-style teams using Git and GitHub for version control during hackathons, successfully engineering the backend logic using MongoDB for numerous full-stack applications, and also swiftly learnt how to integrate the Groq A.I. API for immediate response rendering – the latter experience was my first foray into implementing A.I. technologies into my projects, and had sparked my personal interest in practical A.I. usage and backend-to-frontend coordination. Academically, I also developed DailySips, a Java-based beverage tracker. Here, I built my applications’ user interface entirely through Java Swing, learnt how to implement JSON-based data persistence, writing rigorous JUnit tests to validate my application’s behaviour and improve code robustness. This not only sharpened my technical and analytical skills, but highlighted the importance of detail-oriented thinking, and structured problem-solving — all essential in test planning, execution, and reporting. All of these experiences not only highlights my technical growth, but also showcases my passions for applying software and data tools to real-world problems.</w:t>
+        <w:t xml:space="preserve">While my familiarity with advanced database tools is still growing, I bring a strong foundation in both data science and full-stack development, and am actively bridging my knowledge gaps through self-directed learning. </w:t>
+      </w:r>
+      <w:r>
+        <w:rPr>
+          <w:rFonts w:ascii="Calibri Light" w:hAnsi="Calibri Light" w:cs="Calibri Light"/>
+          <w:sz w:val="18"/>
+          <w:szCs w:val="18"/>
+        </w:rPr>
+        <w:t>For example, through the Google Data Analytics Certificate program, I learnt the foundations of exploratory data analysis, including fundamentals of manipulating data in Excel and SQL through BigQuery, and was introduced to visualization platforms such as Tableau and Power BI. I further expanded my analytical skills through my enrollment in an introductory data science course through my curriculum, where I used R and Jupyter Notebooks to read, transform and clean a dataset of over 1, 500 records for the Pacific Laboratory for Artificial Intelligence. Here, I visualized the data and supported the development of a K-NN regression predictive model to uncover trends from the data, reinforcing my understanding of predictive analytics and data storytelling. Outside of the classroom, I have also worked in small Agile-style teams</w:t>
+      </w:r>
+      <w:r>
+        <w:rPr>
+          <w:rFonts w:ascii="Calibri Light" w:hAnsi="Calibri Light" w:cs="Calibri Light"/>
+          <w:sz w:val="18"/>
+          <w:szCs w:val="18"/>
+        </w:rPr>
+        <w:t xml:space="preserve"> and built independent projects,</w:t>
+      </w:r>
+      <w:r>
+        <w:rPr>
+          <w:rFonts w:ascii="Calibri Light" w:hAnsi="Calibri Light" w:cs="Calibri Light"/>
+          <w:sz w:val="18"/>
+          <w:szCs w:val="18"/>
+        </w:rPr>
+        <w:t xml:space="preserve"> using Git and GitHub for version control</w:t>
+      </w:r>
+      <w:r>
+        <w:rPr>
+          <w:rFonts w:ascii="Calibri Light" w:hAnsi="Calibri Light" w:cs="Calibri Light"/>
+          <w:sz w:val="18"/>
+          <w:szCs w:val="18"/>
+        </w:rPr>
+        <w:t>. As an example, I am currently working on scaling SipLy from an academic Java-based CLI and Swing health tracking application into a full-stack React and Spring Boot web application. On the backend, I learnt how to design RESTful APIs, utilizing the embedded H2 Database Engine to persist user data. As another example, I also built AniMori, a desktop Japanese animation tracker, powered by ElectronJS and React for the frontend, and SQLite for the backend. I first designed and iterated the lightweight database schema, and proceeded to write reusable SQL queries to handle common CRUD operations. These projects and experiences have enhanced my capabilities in assessing real-world problems, coordinating technical workflows and how to iteratively build and improve upon existing designs for continuous improvement. It also helped sharpen my troubleshooting skills to become more structured, and how to think in a detail-oriented manner: all of which are key skills that are required in applying software and data tools towards day-to-day challenges.</w:t>
       </w:r>
     </w:p>
     <w:p>
@@ -658,191 +682,80 @@
           <w:sz w:val="18"/>
           <w:szCs w:val="18"/>
         </w:rPr>
-        <w:t xml:space="preserve">Prior to </w:t>
-      </w:r>
-      <w:r>
-        <w:rPr>
-          <w:rFonts w:ascii="Calibri Light" w:hAnsi="Calibri Light" w:cs="Calibri Light"/>
-          <w:sz w:val="18"/>
-          <w:szCs w:val="18"/>
-        </w:rPr>
-        <w:t>transitioning</w:t>
-      </w:r>
-      <w:r>
-        <w:rPr>
-          <w:rFonts w:ascii="Calibri Light" w:hAnsi="Calibri Light" w:cs="Calibri Light"/>
-          <w:sz w:val="18"/>
-          <w:szCs w:val="18"/>
-        </w:rPr>
-        <w:t xml:space="preserve"> into</w:t>
-      </w:r>
-      <w:r>
-        <w:rPr>
-          <w:rFonts w:ascii="Calibri Light" w:hAnsi="Calibri Light" w:cs="Calibri Light"/>
-          <w:sz w:val="18"/>
-          <w:szCs w:val="18"/>
-        </w:rPr>
-        <w:t xml:space="preserve"> the technology industry, I held a role </w:t>
-      </w:r>
-      <w:r>
-        <w:rPr>
-          <w:rFonts w:ascii="Calibri Light" w:hAnsi="Calibri Light" w:cs="Calibri Light"/>
-          <w:sz w:val="18"/>
-          <w:szCs w:val="18"/>
-        </w:rPr>
-        <w:t>as a clinical genetics technologist</w:t>
-      </w:r>
-      <w:r>
-        <w:rPr>
-          <w:rFonts w:ascii="Calibri Light" w:hAnsi="Calibri Light" w:cs="Calibri Light"/>
-          <w:sz w:val="18"/>
-          <w:szCs w:val="18"/>
-        </w:rPr>
-        <w:t xml:space="preserve"> </w:t>
-      </w:r>
-      <w:r>
-        <w:rPr>
-          <w:rFonts w:ascii="Calibri Light" w:hAnsi="Calibri Light" w:cs="Calibri Light"/>
-          <w:sz w:val="18"/>
-          <w:szCs w:val="18"/>
-        </w:rPr>
-        <w:t>with the Provincial Health Services Authority. In this high-stakes, detail-driven environment, I supported end-to-end diagnostics workflows. From patient specimen accessioning to interpreting results, I brought a passionate work ethic to every task involved,</w:t>
-      </w:r>
-      <w:r>
-        <w:rPr>
-          <w:rFonts w:ascii="Calibri Light" w:hAnsi="Calibri Light" w:cs="Calibri Light"/>
-          <w:sz w:val="18"/>
-          <w:szCs w:val="18"/>
-        </w:rPr>
-        <w:t xml:space="preserve"> collaborating closely with various interdisciplinary healthcare teams </w:t>
-      </w:r>
-      <w:r>
-        <w:rPr>
-          <w:rFonts w:ascii="Calibri Light" w:hAnsi="Calibri Light" w:cs="Calibri Light"/>
-          <w:sz w:val="18"/>
-          <w:szCs w:val="18"/>
-        </w:rPr>
-        <w:t>across the</w:t>
-      </w:r>
-      <w:r>
-        <w:rPr>
-          <w:rFonts w:ascii="Calibri Light" w:hAnsi="Calibri Light" w:cs="Calibri Light"/>
-          <w:sz w:val="18"/>
-          <w:szCs w:val="18"/>
-        </w:rPr>
-        <w:t xml:space="preserve"> hospital system to meet </w:t>
-      </w:r>
-      <w:r>
-        <w:rPr>
-          <w:rFonts w:ascii="Calibri Light" w:hAnsi="Calibri Light" w:cs="Calibri Light"/>
-          <w:sz w:val="18"/>
-          <w:szCs w:val="18"/>
-        </w:rPr>
-        <w:t>strict turnaround times and</w:t>
-      </w:r>
-      <w:r>
-        <w:rPr>
-          <w:rFonts w:ascii="Calibri Light" w:hAnsi="Calibri Light" w:cs="Calibri Light"/>
-          <w:sz w:val="18"/>
-          <w:szCs w:val="18"/>
-        </w:rPr>
-        <w:t xml:space="preserve"> deliver high-quality, compassionate patient care</w:t>
-      </w:r>
-      <w:r>
-        <w:rPr>
-          <w:rFonts w:ascii="Calibri Light" w:hAnsi="Calibri Light" w:cs="Calibri Light"/>
-          <w:sz w:val="18"/>
-          <w:szCs w:val="18"/>
-        </w:rPr>
-        <w:t>.</w:t>
-      </w:r>
-      <w:r>
-        <w:rPr>
-          <w:rFonts w:ascii="Calibri Light" w:hAnsi="Calibri Light" w:cs="Calibri Light"/>
-          <w:sz w:val="18"/>
-          <w:szCs w:val="18"/>
-        </w:rPr>
-        <w:t xml:space="preserve"> </w:t>
-      </w:r>
-      <w:r>
-        <w:rPr>
-          <w:rFonts w:ascii="Calibri Light" w:hAnsi="Calibri Light" w:cs="Calibri Light"/>
-          <w:sz w:val="18"/>
-          <w:szCs w:val="18"/>
-        </w:rPr>
-        <w:t xml:space="preserve">Just as importantly, I also </w:t>
-      </w:r>
-      <w:r>
-        <w:rPr>
-          <w:rFonts w:ascii="Calibri Light" w:hAnsi="Calibri Light" w:cs="Calibri Light"/>
-          <w:sz w:val="18"/>
-          <w:szCs w:val="18"/>
-        </w:rPr>
-        <w:t>took on mentorship responsibilities, training incoming junior technologists and practicum students, helping to foster a collaborative, harmonious learning environment</w:t>
-      </w:r>
-      <w:r>
-        <w:rPr>
-          <w:rFonts w:ascii="Calibri Light" w:hAnsi="Calibri Light" w:cs="Calibri Light"/>
-          <w:sz w:val="18"/>
-          <w:szCs w:val="18"/>
-        </w:rPr>
-        <w:t>: an experience that required clear communication of complex concepts, empathy and patience.</w:t>
-      </w:r>
-      <w:r>
-        <w:rPr>
-          <w:rFonts w:ascii="Calibri Light" w:hAnsi="Calibri Light" w:cs="Calibri Light"/>
-          <w:sz w:val="18"/>
-          <w:szCs w:val="18"/>
-        </w:rPr>
-        <w:t xml:space="preserve"> My role at PHSA highlights many stron</w:t>
-      </w:r>
-      <w:r>
-        <w:rPr>
-          <w:rFonts w:ascii="Calibri Light" w:hAnsi="Calibri Light" w:cs="Calibri Light"/>
-          <w:sz w:val="18"/>
-          <w:szCs w:val="18"/>
-        </w:rPr>
-        <w:t>g</w:t>
-      </w:r>
-      <w:r>
-        <w:rPr>
-          <w:rFonts w:ascii="Calibri Light" w:hAnsi="Calibri Light" w:cs="Calibri Light"/>
-          <w:sz w:val="18"/>
-          <w:szCs w:val="18"/>
-        </w:rPr>
-        <w:t xml:space="preserve"> soft skills, including the ability to learn quickly, and adaptability to various responsibilities. The knowledge I gained here has been vital to furthering my understanding of the complexities of</w:t>
-      </w:r>
-      <w:r>
-        <w:rPr>
-          <w:rFonts w:ascii="Calibri Light" w:hAnsi="Calibri Light" w:cs="Calibri Light"/>
-          <w:sz w:val="18"/>
-          <w:szCs w:val="18"/>
-        </w:rPr>
-        <w:t xml:space="preserve"> diagnostic workflows</w:t>
-      </w:r>
-      <w:r>
-        <w:rPr>
-          <w:rFonts w:ascii="Calibri Light" w:hAnsi="Calibri Light" w:cs="Calibri Light"/>
-          <w:sz w:val="18"/>
-          <w:szCs w:val="18"/>
-        </w:rPr>
-        <w:t>, while further enhancing the necessary skills required to become a more efficient, collaborative and communicative team player.</w:t>
-      </w:r>
-      <w:r>
-        <w:rPr>
-          <w:rFonts w:ascii="Calibri Light" w:hAnsi="Calibri Light" w:cs="Calibri Light"/>
-          <w:sz w:val="18"/>
-          <w:szCs w:val="18"/>
-        </w:rPr>
-        <w:t xml:space="preserve"> It also instilled in me a strong sense of responsibility, diligence and attention to detail: all of which are now carried over into my approaches in hackathon or academic-based projects.</w:t>
-      </w:r>
-      <w:r>
-        <w:rPr>
-          <w:rFonts w:ascii="Calibri Light" w:hAnsi="Calibri Light" w:cs="Calibri Light"/>
-          <w:sz w:val="18"/>
-          <w:szCs w:val="18"/>
-        </w:rPr>
-        <w:t xml:space="preserve"> </w:t>
+        <w:t xml:space="preserve">Currently, I am gaining practical experiences as an Information Technology Analyst Co-op Student with Shared Services Canada, where I am supporting enterprise-level IT workflows for the federal government. This role is not only enhancing my current technical skillset by exposing me to tools used within Agile teams, such as </w:t>
+      </w:r>
+      <w:r>
+        <w:rPr>
+          <w:rFonts w:ascii="Calibri Light" w:hAnsi="Calibri Light" w:cs="Calibri Light"/>
+          <w:sz w:val="18"/>
+          <w:szCs w:val="18"/>
+          <w:highlight w:val="yellow"/>
+        </w:rPr>
+        <w:t>[Include here when starting]</w:t>
+      </w:r>
+      <w:r>
+        <w:rPr>
+          <w:rFonts w:ascii="Calibri Light" w:hAnsi="Calibri Light" w:cs="Calibri Light"/>
+          <w:sz w:val="18"/>
+          <w:szCs w:val="18"/>
+        </w:rPr>
+        <w:t xml:space="preserve">, but is also helping me develop many transferrable skills that are necessary in working in a client-facing role, such as interpersonal communication, time management and task prioritization. </w:t>
+      </w:r>
+      <w:r>
+        <w:rPr>
+          <w:rFonts w:ascii="Calibri Light" w:hAnsi="Calibri Light" w:cs="Calibri Light"/>
+          <w:sz w:val="18"/>
+          <w:szCs w:val="18"/>
+        </w:rPr>
+        <w:t>Prior to pursuing software development, I worked for nearly three years as a clinical genetics technologist, where I gained valuable experience with the Genome Diagnostics team at the Provincial Health Services Authority. In this high-stakes, detail-driven environment, I supported end-to-end diagnostic workflows – from accessioning biohazardous patient specimens to interpreting results, I brought a passionate work ethic to every task involved. I routinely worked with our laboratory information systems for reporting results</w:t>
+      </w:r>
+      <w:r>
+        <w:rPr>
+          <w:rFonts w:ascii="Calibri Light" w:hAnsi="Calibri Light" w:cs="Calibri Light"/>
+          <w:sz w:val="18"/>
+          <w:szCs w:val="18"/>
+        </w:rPr>
+        <w:t>,</w:t>
+      </w:r>
+      <w:r>
+        <w:rPr>
+          <w:rFonts w:ascii="Calibri Light" w:hAnsi="Calibri Light" w:cs="Calibri Light"/>
+          <w:sz w:val="18"/>
+          <w:szCs w:val="18"/>
+        </w:rPr>
+        <w:t xml:space="preserve"> and collaborated in a cross-functional team consisting of researchers, clinicians and technologists to ensure test results were delivered under established turnaround times. This required meticulous attention to detail and a high commitment to quality and accuracy. Just as importantly, I also took on mentorship responsibilities, training incoming junior technologists and practicum students, helping to foster a collaborative, growth-oriented learning environment: an experience that required clear communication, empathy and patience. My role at PHSA highlights many necessary soft skills, including the ability to learn quickly, adaptability to various responsibilities, and the ability to effectively communicate complex concepts </w:t>
+      </w:r>
+      <w:r>
+        <w:rPr>
+          <w:rFonts w:ascii="Calibri Light" w:hAnsi="Calibri Light" w:cs="Calibri Light"/>
+          <w:sz w:val="18"/>
+          <w:szCs w:val="18"/>
+        </w:rPr>
+        <w:t>concisely</w:t>
+      </w:r>
+      <w:r>
+        <w:rPr>
+          <w:rFonts w:ascii="Calibri Light" w:hAnsi="Calibri Light" w:cs="Calibri Light"/>
+          <w:sz w:val="18"/>
+          <w:szCs w:val="18"/>
+        </w:rPr>
+        <w:t xml:space="preserve">. This role instilled in me a strong sense of responsibility, which are all traits that now carry over into how I approach </w:t>
+      </w:r>
+      <w:r>
+        <w:rPr>
+          <w:rFonts w:ascii="Calibri Light" w:hAnsi="Calibri Light" w:cs="Calibri Light"/>
+          <w:sz w:val="18"/>
+          <w:szCs w:val="18"/>
+        </w:rPr>
+        <w:t>analytics</w:t>
+      </w:r>
+      <w:r>
+        <w:rPr>
+          <w:rFonts w:ascii="Calibri Light" w:hAnsi="Calibri Light" w:cs="Calibri Light"/>
+          <w:sz w:val="18"/>
+          <w:szCs w:val="18"/>
+        </w:rPr>
+        <w:t>, testing and team-based projects.</w:t>
       </w:r>
     </w:p>
     <w:p>
@@ -1092,15 +1005,6 @@
           <w:szCs w:val="18"/>
         </w:rPr>
         <w:t>Best regards,</w:t>
-      </w:r>
-      <w:r>
-        <w:rPr>
-          <w:rFonts w:ascii="Calibri Light" w:hAnsi="Calibri Light" w:cs="Calibri Light"/>
-          <w:color w:val="111111"/>
-          <w:sz w:val="18"/>
-          <w:szCs w:val="18"/>
-        </w:rPr>
-        <w:br/>
       </w:r>
     </w:p>
     <w:p>

</xml_diff>